<commit_message>
Add 2026 software tools to portfolio and CV
</commit_message>
<xml_diff>
--- a/assets/Ahmad_Ibrahim_CV_Final_Improved.docx
+++ b/assets/Ahmad_Ibrahim_CV_Final_Improved.docx
@@ -630,6 +630,77 @@
         </w:rPr>
         <w:t>: Arabic: Native | English: Basic - able to read technical GIS/CAD terms and use software interfaces with support from translation tools.</w:t>
       </w:r>
+    </w:p>
+    <w:p>
+      <w:pPr>
+        <w:pStyle w:val="Heading2"/>
+      </w:pPr>
+      <w:r>
+        <w:t>SOFTWARE TOOLS DEVELOPMENT (2026)</w:t>
+      </w:r>
+    </w:p>
+    <w:p>
+      <w:pPr/>
+      <w:r>
+        <w:t>Developed a set of practical GIS, CAD, PDF plotting, data transfer, and stormwater-network automation tools in 2026 to support mapping, infrastructure data preparation, file handling, and workflow improvement.</w:t>
+      </w:r>
+    </w:p>
+    <w:p>
+      <w:pPr/>
+      <w:r>
+        <w:t>? Atlas of Egyptian Curriculums Maps App: Developed a maps application for Egyptian curriculum atlas and map workflows.</w:t>
+      </w:r>
+    </w:p>
+    <w:p>
+      <w:pPr/>
+      <w:r>
+        <w:t>? DropAndCopy: Developed a file handling tool to support faster copy/drop workflows during daily project organization.</w:t>
+      </w:r>
+    </w:p>
+    <w:p>
+      <w:pPr/>
+      <w:r>
+        <w:t>? GIS_Data_Repositories_Professional_2026: Developed a structured GIS data repository package for professional 2026 GIS project organization.</w:t>
+      </w:r>
+    </w:p>
+    <w:p>
+      <w:pPr/>
+      <w:r>
+        <w:t>? Qtra Pipe Auto Run: Developed an automation tool for pipe-related workflow execution and repetitive infrastructure processing steps.</w:t>
+      </w:r>
+    </w:p>
+    <w:p>
+      <w:pPr/>
+      <w:r>
+        <w:t>? RoboTransfer: Developed an automation utility for transferring files and project outputs between working locations.</w:t>
+      </w:r>
+    </w:p>
+    <w:p>
+      <w:pPr/>
+      <w:r>
+        <w:t>? Smart Plot PDF: Developed a PDF plotting/export support tool for faster map and layout production.</w:t>
+      </w:r>
+    </w:p>
+    <w:p>
+      <w:pPr/>
+      <w:r>
+        <w:t>? SmartCalculator: Developed a calculation utility to support repeated technical and data-processing calculations.</w:t>
+      </w:r>
+    </w:p>
+    <w:p>
+      <w:pPr/>
+      <w:r>
+        <w:t>? SmartGully: Developed a tool supporting stormwater gully-related workflows and drainage network preparation tasks.</w:t>
+      </w:r>
+    </w:p>
+    <w:p>
+      <w:pPr/>
+      <w:r>
+        <w:t>? Text File to Storm Network Shapefile Toolbox v1.8: Developed a toolbox for converting text-file storm network data into shapefile outputs for GIS and stormwater workflows.</w:t>
+      </w:r>
+    </w:p>
+    <w:p>
+      <w:pPr/>
     </w:p>
     <w:p>
       <w:pPr>

</xml_diff>

<commit_message>
Update portfolio and CV
</commit_message>
<xml_diff>
--- a/assets/Ahmad_Ibrahim_CV_Final_Improved.docx
+++ b/assets/Ahmad_Ibrahim_CV_Final_Improved.docx
@@ -476,7 +476,14 @@
         <w:t xml:space="preserve">• </w:t>
       </w:r>
       <w:r>
-        <w:t>GIS &amp; Spatial Analysis: ArcGIS, QGIS, geodatabase design, spatial analysis, map production, terrain/DEM analysis, shapefile/KML handling.</w:t>
+        <w:rPr>
+          <w:b/>
+          <w:bCs/>
+        </w:rPr>
+        <w:t>GIS &amp; Spatial Analysis:</w:t>
+      </w:r>
+      <w:r>
+        <w:t xml:space="preserve"> ArcGIS, QGIS, geodatabase design, spatial analysis, map production, terrain/DEM analysis, shapefile/KML handling.</w:t>
       </w:r>
     </w:p>
     <w:p>
@@ -492,7 +499,14 @@
         <w:t xml:space="preserve">• </w:t>
       </w:r>
       <w:r>
-        <w:t>Stormwater &amp; Groundwater: Stormwater drainage networks, groundwater reduction networks, dewatering systems, urgent drainage solutions, alternative drainage routes, hydrological report support.</w:t>
+        <w:rPr>
+          <w:b/>
+          <w:bCs/>
+        </w:rPr>
+        <w:t>Stormwater &amp; Groundwater:</w:t>
+      </w:r>
+      <w:r>
+        <w:t xml:space="preserve"> Stormwater drainage networks, groundwater reduction networks, dewatering systems, urgent drainage solutions, alternative drainage routes, hydrological report support.</w:t>
       </w:r>
     </w:p>
     <w:p>
@@ -508,7 +522,14 @@
         <w:t xml:space="preserve">• </w:t>
       </w:r>
       <w:r>
-        <w:t>InfraWizard &amp; Engineering Data: InfraWizard network preparation, SewerGEMS/StormCAD data preparation, FlexTable cleanup, pipe/manhole attributes, profiles, summaries, layouts.</w:t>
+        <w:rPr>
+          <w:b/>
+          <w:bCs/>
+        </w:rPr>
+        <w:t>InfraWizard &amp; Engineering Data:</w:t>
+      </w:r>
+      <w:r>
+        <w:t xml:space="preserve"> InfraWizard network preparation, SewerGEMS/StormCAD data preparation, FlexTable cleanup, pipe/manhole attributes, profiles, summaries, layouts.</w:t>
       </w:r>
     </w:p>
     <w:p>
@@ -564,43 +585,13 @@
         <w:rPr>
           <w:b/>
         </w:rPr>
-        <w:t xml:space="preserve"> </w:t>
-      </w:r>
-      <w:r>
-        <w:rPr>
-          <w:b/>
-        </w:rPr>
-        <w:t>• Software / Tools</w:t>
+        <w:t xml:space="preserve"> • Software / Tools</w:t>
       </w:r>
       <w:r>
         <w:rPr>
           <w:bCs/>
         </w:rPr>
-        <w:t>: InfraWizard, ArcGIS/ArcMap,</w:t>
-      </w:r>
-      <w:r>
-        <w:rPr>
-          <w:bCs/>
-        </w:rPr>
-        <w:t xml:space="preserve"> ArcGIS Pro,</w:t>
-      </w:r>
-      <w:r>
-        <w:rPr>
-          <w:bCs/>
-        </w:rPr>
-        <w:t xml:space="preserve"> QGIS, AutoCAD, Civil 3D, SewerGEMS/StormCAD data preparation, SAS Planet, Excel, </w:t>
-      </w:r>
-      <w:r>
-        <w:rPr>
-          <w:bCs/>
-        </w:rPr>
-        <w:t>KML, Shapefiles</w:t>
-      </w:r>
-      <w:r>
-        <w:rPr>
-          <w:bCs/>
-        </w:rPr>
-        <w:t>, and Geodatabases.</w:t>
+        <w:t>: InfraWizard, ArcGIS/ArcMap, ArcGIS Pro, QGIS, AutoCAD, Civil 3D, SewerGEMS/StormCAD data preparation, SAS Planet, Excel, KML, Shapefiles, and Geodatabases.</w:t>
       </w:r>
     </w:p>
     <w:p>
@@ -616,13 +607,7 @@
         <w:rPr>
           <w:b/>
         </w:rPr>
-        <w:t xml:space="preserve"> </w:t>
-      </w:r>
-      <w:r>
-        <w:rPr>
-          <w:b/>
-        </w:rPr>
-        <w:t>• Languages</w:t>
+        <w:t xml:space="preserve"> • Languages</w:t>
       </w:r>
       <w:r>
         <w:rPr>
@@ -640,67 +625,416 @@
       </w:r>
     </w:p>
     <w:p>
-      <w:pPr/>
-      <w:r>
-        <w:t>Developed a set of practical GIS, CAD, PDF plotting, data transfer, and stormwater-network automation tools in 2026 to support mapping, infrastructure data preparation, file handling, and workflow improvement.</w:t>
+      <w:pPr>
+        <w:jc w:val="lowKashida"/>
+        <w:rPr>
+          <w:b/>
+          <w:bCs/>
+        </w:rPr>
+      </w:pPr>
+      <w:r>
+        <w:rPr>
+          <w:b/>
+          <w:bCs/>
+        </w:rPr>
+        <w:t xml:space="preserve">Developed a set of practical </w:t>
+      </w:r>
+      <w:proofErr w:type="gramStart"/>
+      <w:r>
+        <w:rPr>
+          <w:b/>
+          <w:bCs/>
+        </w:rPr>
+        <w:t>GIS</w:t>
+      </w:r>
+      <w:proofErr w:type="gramEnd"/>
+      <w:r>
+        <w:rPr>
+          <w:b/>
+          <w:bCs/>
+        </w:rPr>
+        <w:t>, CAD, PDF plotting, data transfer, and stormwater-network automation tools in 2026 to support mapping, infrastructure data preparation, file handling, and workflow improvement.</w:t>
       </w:r>
     </w:p>
     <w:p>
-      <w:pPr/>
-      <w:r>
-        <w:t>? Atlas of Egyptian Curriculums Maps App: Developed a maps application for Egyptian curriculum atlas and map workflows.</w:t>
+      <w:pPr>
+        <w:spacing w:after="12"/>
+        <w:ind w:left="259" w:hanging="173"/>
+        <w:jc w:val="lowKashida"/>
+        <w:rPr>
+          <w:bCs/>
+        </w:rPr>
+      </w:pPr>
+      <w:r>
+        <w:rPr>
+          <w:b/>
+        </w:rPr>
+        <w:t xml:space="preserve">• </w:t>
+      </w:r>
+      <w:r>
+        <w:rPr>
+          <w:b/>
+        </w:rPr>
+        <w:t xml:space="preserve"> Atlas of Egyptian Curriculums Maps App: </w:t>
+      </w:r>
+      <w:r>
+        <w:rPr>
+          <w:bCs/>
+        </w:rPr>
+        <w:t>Developed a maps application for Egyptian curriculum atlas and map workflows.</w:t>
       </w:r>
     </w:p>
     <w:p>
-      <w:pPr/>
-      <w:r>
-        <w:t>? DropAndCopy: Developed a file handling tool to support faster copy/drop workflows during daily project organization.</w:t>
+      <w:pPr>
+        <w:spacing w:after="12"/>
+        <w:ind w:left="259" w:hanging="173"/>
+        <w:jc w:val="lowKashida"/>
+        <w:rPr>
+          <w:b/>
+        </w:rPr>
+      </w:pPr>
+      <w:r>
+        <w:rPr>
+          <w:b/>
+        </w:rPr>
+        <w:t xml:space="preserve">• </w:t>
+      </w:r>
+      <w:r>
+        <w:rPr>
+          <w:b/>
+        </w:rPr>
+        <w:t xml:space="preserve"> </w:t>
+      </w:r>
+      <w:proofErr w:type="spellStart"/>
+      <w:r>
+        <w:rPr>
+          <w:b/>
+        </w:rPr>
+        <w:t>DropAndCopy</w:t>
+      </w:r>
+      <w:proofErr w:type="spellEnd"/>
+      <w:r>
+        <w:rPr>
+          <w:b/>
+        </w:rPr>
+        <w:t xml:space="preserve">: </w:t>
+      </w:r>
+      <w:r>
+        <w:rPr>
+          <w:bCs/>
+        </w:rPr>
+        <w:t>Developed a file handling tool to support faster copy/drop workflows during daily project organization.</w:t>
       </w:r>
     </w:p>
     <w:p>
-      <w:pPr/>
-      <w:r>
-        <w:t>? GIS_Data_Repositories_Professional_2026: Developed a structured GIS data repository package for professional 2026 GIS project organization.</w:t>
+      <w:pPr>
+        <w:spacing w:after="12"/>
+        <w:ind w:left="259" w:hanging="173"/>
+        <w:jc w:val="lowKashida"/>
+        <w:rPr>
+          <w:b/>
+        </w:rPr>
+      </w:pPr>
+      <w:r>
+        <w:rPr>
+          <w:b/>
+        </w:rPr>
+        <w:t xml:space="preserve">• </w:t>
+      </w:r>
+      <w:r>
+        <w:rPr>
+          <w:b/>
+        </w:rPr>
+        <w:t xml:space="preserve"> GIS</w:t>
+      </w:r>
+      <w:r>
+        <w:rPr>
+          <w:b/>
+        </w:rPr>
+        <w:t xml:space="preserve"> </w:t>
+      </w:r>
+      <w:r>
+        <w:rPr>
+          <w:b/>
+        </w:rPr>
+        <w:t>Data</w:t>
+      </w:r>
+      <w:r>
+        <w:rPr>
+          <w:b/>
+        </w:rPr>
+        <w:t xml:space="preserve"> </w:t>
+      </w:r>
+      <w:r>
+        <w:rPr>
+          <w:b/>
+        </w:rPr>
+        <w:t>Repositories</w:t>
+      </w:r>
+      <w:r>
+        <w:rPr>
+          <w:b/>
+        </w:rPr>
+        <w:t xml:space="preserve"> </w:t>
+      </w:r>
+      <w:r>
+        <w:rPr>
+          <w:b/>
+        </w:rPr>
+        <w:t>Professional</w:t>
+      </w:r>
+      <w:r>
+        <w:rPr>
+          <w:b/>
+        </w:rPr>
+        <w:t xml:space="preserve"> </w:t>
+      </w:r>
+      <w:r>
+        <w:rPr>
+          <w:b/>
+        </w:rPr>
+        <w:t xml:space="preserve">2026: </w:t>
+      </w:r>
+      <w:r>
+        <w:rPr>
+          <w:bCs/>
+        </w:rPr>
+        <w:t>Developed a structured GIS data repository package for professional 2026 GIS project organization.</w:t>
       </w:r>
     </w:p>
     <w:p>
-      <w:pPr/>
-      <w:r>
-        <w:t>? Qtra Pipe Auto Run: Developed an automation tool for pipe-related workflow execution and repetitive infrastructure processing steps.</w:t>
+      <w:pPr>
+        <w:spacing w:after="12"/>
+        <w:ind w:left="259" w:hanging="173"/>
+        <w:jc w:val="lowKashida"/>
+        <w:rPr>
+          <w:b/>
+        </w:rPr>
+      </w:pPr>
+      <w:r>
+        <w:rPr>
+          <w:b/>
+        </w:rPr>
+        <w:t xml:space="preserve">• </w:t>
+      </w:r>
+      <w:r>
+        <w:rPr>
+          <w:b/>
+        </w:rPr>
+        <w:t xml:space="preserve"> </w:t>
+      </w:r>
+      <w:proofErr w:type="spellStart"/>
+      <w:r>
+        <w:rPr>
+          <w:b/>
+        </w:rPr>
+        <w:t>Qtra</w:t>
+      </w:r>
+      <w:proofErr w:type="spellEnd"/>
+      <w:r>
+        <w:rPr>
+          <w:b/>
+        </w:rPr>
+        <w:t xml:space="preserve"> Pipe Auto Run: </w:t>
+      </w:r>
+      <w:r>
+        <w:rPr>
+          <w:bCs/>
+        </w:rPr>
+        <w:t>Developed an automation tool for pipe-related workflow execution and repetitive infrastructure processing steps.</w:t>
       </w:r>
     </w:p>
     <w:p>
-      <w:pPr/>
-      <w:r>
-        <w:t>? RoboTransfer: Developed an automation utility for transferring files and project outputs between working locations.</w:t>
+      <w:pPr>
+        <w:spacing w:after="12"/>
+        <w:ind w:left="259" w:hanging="173"/>
+        <w:jc w:val="lowKashida"/>
+        <w:rPr>
+          <w:b/>
+        </w:rPr>
+      </w:pPr>
+      <w:r>
+        <w:rPr>
+          <w:b/>
+        </w:rPr>
+        <w:t xml:space="preserve">• </w:t>
+      </w:r>
+      <w:r>
+        <w:rPr>
+          <w:b/>
+        </w:rPr>
+        <w:t xml:space="preserve"> </w:t>
+      </w:r>
+      <w:proofErr w:type="spellStart"/>
+      <w:r>
+        <w:rPr>
+          <w:b/>
+        </w:rPr>
+        <w:t>RoboTransfer</w:t>
+      </w:r>
+      <w:proofErr w:type="spellEnd"/>
+      <w:r>
+        <w:rPr>
+          <w:b/>
+        </w:rPr>
+        <w:t xml:space="preserve">: </w:t>
+      </w:r>
+      <w:r>
+        <w:rPr>
+          <w:bCs/>
+        </w:rPr>
+        <w:t>Developed an automation utility for transferring files and project outputs between working locations.</w:t>
       </w:r>
     </w:p>
     <w:p>
-      <w:pPr/>
-      <w:r>
-        <w:t>? Smart Plot PDF: Developed a PDF plotting/export support tool for faster map and layout production.</w:t>
+      <w:pPr>
+        <w:spacing w:after="12"/>
+        <w:ind w:left="259" w:hanging="173"/>
+        <w:jc w:val="lowKashida"/>
+        <w:rPr>
+          <w:b/>
+        </w:rPr>
+      </w:pPr>
+      <w:r>
+        <w:rPr>
+          <w:b/>
+        </w:rPr>
+        <w:t xml:space="preserve">• </w:t>
+      </w:r>
+      <w:r>
+        <w:rPr>
+          <w:b/>
+        </w:rPr>
+        <w:t xml:space="preserve"> Smart Plot PDF: </w:t>
+      </w:r>
+      <w:r>
+        <w:rPr>
+          <w:bCs/>
+        </w:rPr>
+        <w:t>Developed a PDF plotting/export support tool for faster map and layout production.</w:t>
       </w:r>
     </w:p>
     <w:p>
-      <w:pPr/>
-      <w:r>
-        <w:t>? SmartCalculator: Developed a calculation utility to support repeated technical and data-processing calculations.</w:t>
+      <w:pPr>
+        <w:spacing w:after="12"/>
+        <w:ind w:left="259" w:hanging="173"/>
+        <w:jc w:val="lowKashida"/>
+        <w:rPr>
+          <w:bCs/>
+        </w:rPr>
+      </w:pPr>
+      <w:r>
+        <w:rPr>
+          <w:b/>
+        </w:rPr>
+        <w:t xml:space="preserve">• </w:t>
+      </w:r>
+      <w:r>
+        <w:rPr>
+          <w:b/>
+        </w:rPr>
+        <w:t xml:space="preserve"> </w:t>
+      </w:r>
+      <w:proofErr w:type="spellStart"/>
+      <w:r>
+        <w:rPr>
+          <w:b/>
+        </w:rPr>
+        <w:t>SmartCalculator</w:t>
+      </w:r>
+      <w:proofErr w:type="spellEnd"/>
+      <w:r>
+        <w:rPr>
+          <w:b/>
+        </w:rPr>
+        <w:t xml:space="preserve">: </w:t>
+      </w:r>
+      <w:r>
+        <w:rPr>
+          <w:bCs/>
+        </w:rPr>
+        <w:t>Developed a calculation utility to support repeated technical and data-processing calculations.</w:t>
       </w:r>
     </w:p>
     <w:p>
-      <w:pPr/>
-      <w:r>
-        <w:t>? SmartGully: Developed a tool supporting stormwater gully-related workflows and drainage network preparation tasks.</w:t>
+      <w:pPr>
+        <w:spacing w:after="12"/>
+        <w:ind w:left="259" w:hanging="173"/>
+        <w:jc w:val="lowKashida"/>
+        <w:rPr>
+          <w:bCs/>
+        </w:rPr>
+      </w:pPr>
+      <w:r>
+        <w:rPr>
+          <w:b/>
+        </w:rPr>
+        <w:t xml:space="preserve">• </w:t>
+      </w:r>
+      <w:r>
+        <w:rPr>
+          <w:b/>
+        </w:rPr>
+        <w:t xml:space="preserve"> </w:t>
+      </w:r>
+      <w:proofErr w:type="spellStart"/>
+      <w:r>
+        <w:rPr>
+          <w:b/>
+        </w:rPr>
+        <w:t>SmartGully</w:t>
+      </w:r>
+      <w:proofErr w:type="spellEnd"/>
+      <w:r>
+        <w:rPr>
+          <w:b/>
+        </w:rPr>
+        <w:t xml:space="preserve">: </w:t>
+      </w:r>
+      <w:r>
+        <w:rPr>
+          <w:bCs/>
+        </w:rPr>
+        <w:t>Developed a tool supporting stormwater gully-related workflows and drainage network preparation tasks.</w:t>
       </w:r>
     </w:p>
     <w:p>
-      <w:pPr/>
-      <w:r>
-        <w:t>? Text File to Storm Network Shapefile Toolbox v1.8: Developed a toolbox for converting text-file storm network data into shapefile outputs for GIS and stormwater workflows.</w:t>
+      <w:pPr>
+        <w:spacing w:after="12"/>
+        <w:ind w:left="259" w:hanging="173"/>
+        <w:jc w:val="lowKashida"/>
+        <w:rPr>
+          <w:bCs/>
+        </w:rPr>
+      </w:pPr>
+      <w:r>
+        <w:rPr>
+          <w:b/>
+        </w:rPr>
+        <w:t xml:space="preserve">• </w:t>
+      </w:r>
+      <w:r>
+        <w:rPr>
+          <w:b/>
+        </w:rPr>
+        <w:t xml:space="preserve"> Text File to Storm Network Shapefile Toolbox v1.8: </w:t>
+      </w:r>
+      <w:r>
+        <w:rPr>
+          <w:bCs/>
+        </w:rPr>
+        <w:t>Developed a toolbox for converting text-file storm network data into shapefile outputs for GIS and stormwater workflows.</w:t>
       </w:r>
     </w:p>
     <w:p>
-      <w:pPr/>
+      <w:pPr>
+        <w:spacing w:after="12"/>
+        <w:ind w:left="259" w:hanging="173"/>
+        <w:jc w:val="lowKashida"/>
+        <w:rPr>
+          <w:b/>
+        </w:rPr>
+      </w:pPr>
     </w:p>
     <w:p>
       <w:pPr>
@@ -805,6 +1139,7 @@
         <w:rPr>
           <w:b/>
         </w:rPr>
+        <w:lastRenderedPageBreak/>
         <w:t xml:space="preserve">• </w:t>
       </w:r>
       <w:r>
@@ -933,7 +1268,14 @@
         <w:t xml:space="preserve">• </w:t>
       </w:r>
       <w:r>
-        <w:t>Stormwater &amp; Groundwater Network Projects - Jeddah, KSA: Supported and prepared dozens of urgent drainage solutions, alternative drainage routes, groundwater reduction lines, and stormwater layouts using InfraWizard, GIS, CAD, KML, and PDF deliverables.</w:t>
+        <w:rPr>
+          <w:b/>
+          <w:bCs/>
+        </w:rPr>
+        <w:t>Stormwater &amp; Groundwater Network Projects - Jeddah, KSA:</w:t>
+      </w:r>
+      <w:r>
+        <w:t xml:space="preserve"> Supported and prepared dozens of urgent drainage solutions, alternative drainage routes, groundwater reduction lines, and stormwater layouts using InfraWizard, GIS, CAD, KML, and PDF deliverables.</w:t>
       </w:r>
     </w:p>
     <w:p>
@@ -949,7 +1291,14 @@
         <w:t xml:space="preserve">• </w:t>
       </w:r>
       <w:r>
-        <w:t>AL Jawaharah Mall Stormwater Drainage Network - Jeddah, KSA: Prepared stormwater drainage layout support including manholes, catch basins, pipe diameters, slopes, invert levels, depths, coordinates, overflow pipes, and network summary outputs.</w:t>
+        <w:rPr>
+          <w:b/>
+          <w:bCs/>
+        </w:rPr>
+        <w:t>AL Jawaharah Mall Stormwater Drainage Network - Jeddah, KSA:</w:t>
+      </w:r>
+      <w:r>
+        <w:t xml:space="preserve"> Prepared stormwater drainage layout support including manholes, catch basins, pipe diameters, slopes, invert levels, depths, coordinates, overflow pipes, and network summary outputs.</w:t>
       </w:r>
     </w:p>
     <w:p>
@@ -962,11 +1311,17 @@
         <w:rPr>
           <w:b/>
         </w:rPr>
-        <w:lastRenderedPageBreak/>
         <w:t xml:space="preserve">• </w:t>
       </w:r>
       <w:r>
-        <w:t>Groundwater Network Survey Project - Jeddah, KSA (2022): Developed and managed GIS/CAD datasets for groundwater and drainage networks, including survey data conversion, plan extraction, and engineering profile preparation.</w:t>
+        <w:rPr>
+          <w:b/>
+          <w:bCs/>
+        </w:rPr>
+        <w:t>Groundwater Network Survey Project - Jeddah, KSA (2022):</w:t>
+      </w:r>
+      <w:r>
+        <w:t xml:space="preserve"> Developed and managed GIS/CAD datasets for groundwater and drainage networks, including survey data conversion, plan extraction, and engineering profile preparation.</w:t>
       </w:r>
     </w:p>
     <w:p>
@@ -982,7 +1337,14 @@
         <w:t xml:space="preserve">• </w:t>
       </w:r>
       <w:r>
-        <w:t>Stormwater Drainage Networks - Jeddah Municipality (2023): Contributed to network drafting and GIS support across multiple planning zones, including Plans 583/G/S, 654/G/S, 677/G/S, 679/G/S, 680/G/S, 681/G/S, 682/G/S, 683/G/S, 704/G/S, 705/G/S, and 718/G/S.</w:t>
+        <w:rPr>
+          <w:b/>
+          <w:bCs/>
+        </w:rPr>
+        <w:t>Stormwater Drainage Networks - Jeddah Municipality (2023):</w:t>
+      </w:r>
+      <w:r>
+        <w:t xml:space="preserve"> Contributed to network drafting and GIS support across multiple planning zones, including Plans 583/G/S, 654/G/S, 677/G/S, 679/G/S, 680/G/S, 681/G/S, 682/G/S, 683/G/S, 704/G/S, 705/G/S, and 718/G/S.</w:t>
       </w:r>
     </w:p>
     <w:p>
@@ -998,7 +1360,14 @@
         <w:t xml:space="preserve">• </w:t>
       </w:r>
       <w:r>
-        <w:t>Groundwater Control &amp; Dewatering Systems - Jeddah, KSA: Prepared drafting and GIS support for commercial, residential, and infrastructure dewatering projects in Alruwais, Alhamraa, Alkhalidiah, Alaziziah, Alasalah, and other districts.</w:t>
+        <w:rPr>
+          <w:b/>
+          <w:bCs/>
+        </w:rPr>
+        <w:t>Groundwater Control &amp; Dewatering Systems - Jeddah, KSA:</w:t>
+      </w:r>
+      <w:r>
+        <w:t xml:space="preserve"> Prepared drafting and GIS support for commercial, residential, and infrastructure dewatering projects in Alruwais, Alhamraa, Alkhalidiah, Alaziziah, Alasalah, and other districts.</w:t>
       </w:r>
     </w:p>
     <w:p>
@@ -1014,7 +1383,14 @@
         <w:t xml:space="preserve">• </w:t>
       </w:r>
       <w:r>
-        <w:t>Flood Protection for Wadi Laban - Riyadh, KSA: Supported mapping, drafting, and engineering documentation related to flood protection works.</w:t>
+        <w:rPr>
+          <w:b/>
+          <w:bCs/>
+        </w:rPr>
+        <w:t>Flood Protection for Wadi Laban - Riyadh, KSA:</w:t>
+      </w:r>
+      <w:r>
+        <w:t xml:space="preserve"> Supported mapping, drafting, and engineering documentation related to flood protection works.</w:t>
       </w:r>
     </w:p>
     <w:p>
@@ -1030,7 +1406,14 @@
         <w:t xml:space="preserve">• </w:t>
       </w:r>
       <w:r>
-        <w:t>CAD-to-GIS Electrical Plans - Jeddah, KSA: Converted electrical plans from CAD files into GIS databases, including Plans 675, 679, and 680.</w:t>
+        <w:rPr>
+          <w:b/>
+          <w:bCs/>
+        </w:rPr>
+        <w:t>CAD-to-GIS Electrical Plans - Jeddah, KSA:</w:t>
+      </w:r>
+      <w:r>
+        <w:t xml:space="preserve"> Converted electrical plans from CAD files into GIS databases, including Plans 675, 679, and 680.</w:t>
       </w:r>
     </w:p>
     <w:p>
@@ -1046,7 +1429,14 @@
         <w:t xml:space="preserve">• </w:t>
       </w:r>
       <w:r>
-        <w:t>Climate Resilient ICZM Plan for the North Coast of Egypt (2023): Contributed GIS and mapping support to climate-resilient integrated coastal zone management documentation.</w:t>
+        <w:rPr>
+          <w:b/>
+          <w:bCs/>
+        </w:rPr>
+        <w:t>Climate Resilient ICZM Plan for the North Coast of Egypt (2023):</w:t>
+      </w:r>
+      <w:r>
+        <w:t xml:space="preserve"> Contributed GIS and mapping support to climate-resilient integrated coastal zone management documentation.</w:t>
       </w:r>
     </w:p>
     <w:p>
@@ -1076,7 +1466,17 @@
         <w:t xml:space="preserve">• </w:t>
       </w:r>
       <w:r>
-        <w:t>Authored Atlas of Egypt, the Arab World and the World, registered with the National Library and Archives of Egypt under Local Deposit No. 2021/20535 and ISBN 9789779095615.</w:t>
+        <w:t xml:space="preserve">Authored </w:t>
+      </w:r>
+      <w:r>
+        <w:rPr>
+          <w:b/>
+          <w:bCs/>
+        </w:rPr>
+        <w:t>Atlas of Egypt, the Arab World and the World</w:t>
+      </w:r>
+      <w:r>
+        <w:t>, registered with the National Library and Archives of Egypt under Local Deposit No. 2021/20535 and ISBN 9789779095615.</w:t>
       </w:r>
     </w:p>
     <w:p>
@@ -1092,7 +1492,17 @@
         <w:t xml:space="preserve">• </w:t>
       </w:r>
       <w:r>
-        <w:t>Authored Atlas of the World and the Arab World, registered with the National Library and Archives of Egypt under Local Deposit No. 2022/15361 and ISBN 9789779425962.</w:t>
+        <w:t xml:space="preserve">Authored </w:t>
+      </w:r>
+      <w:r>
+        <w:rPr>
+          <w:b/>
+          <w:bCs/>
+        </w:rPr>
+        <w:t>Atlas of the World and the Arab World</w:t>
+      </w:r>
+      <w:r>
+        <w:t>, registered with the National Library and Archives of Egypt under Local Deposit No. 2022/15361 and ISBN 9789779425962.</w:t>
       </w:r>
     </w:p>
     <w:p>
@@ -1108,7 +1518,17 @@
         <w:t xml:space="preserve">• </w:t>
       </w:r>
       <w:r>
-        <w:t>Authored Atlas of Geography of Egypt, registered with the National Library and Archives of Egypt under Local Deposit No. 2022/15362 and ISBN 9789779425979.</w:t>
+        <w:t xml:space="preserve">Authored </w:t>
+      </w:r>
+      <w:r>
+        <w:rPr>
+          <w:b/>
+          <w:bCs/>
+        </w:rPr>
+        <w:t>Atlas of Geography of Egypt</w:t>
+      </w:r>
+      <w:r>
+        <w:t>, registered with the National Library and Archives of Egypt under Local Deposit No. 2022/15362 and ISBN 9789779425979.</w:t>
       </w:r>
     </w:p>
     <w:p>
@@ -1124,7 +1544,17 @@
         <w:t xml:space="preserve">• </w:t>
       </w:r>
       <w:r>
-        <w:t>Authored Atlas of Geography of Development, registered with the National Library and Archives of Egypt under Local Deposit No. 2022/15363 and ISBN 9789779425986.</w:t>
+        <w:t xml:space="preserve">Authored </w:t>
+      </w:r>
+      <w:r>
+        <w:rPr>
+          <w:b/>
+          <w:bCs/>
+        </w:rPr>
+        <w:t>Atlas of Geography of Development</w:t>
+      </w:r>
+      <w:r>
+        <w:t>, registered with the National Library and Archives of Egypt under Local Deposit No. 2022/15363 and ISBN 9789779425986.</w:t>
       </w:r>
     </w:p>
     <w:p>
@@ -1140,7 +1570,17 @@
         <w:t xml:space="preserve">• </w:t>
       </w:r>
       <w:r>
-        <w:t>Authored Atlas of Political Geography, registered with the National Library and Archives of Egypt under Local Deposit No. 2022/15364 and ISBN 9789779425993.</w:t>
+        <w:t xml:space="preserve">Authored </w:t>
+      </w:r>
+      <w:r>
+        <w:rPr>
+          <w:b/>
+          <w:bCs/>
+        </w:rPr>
+        <w:t>Atlas of Political Geography</w:t>
+      </w:r>
+      <w:r>
+        <w:t>, registered with the National Library and Archives of Egypt under Local Deposit No. 2022/15364 and ISBN 9789779425993.</w:t>
       </w:r>
     </w:p>
     <w:p>
@@ -1156,7 +1596,17 @@
         <w:t xml:space="preserve">• </w:t>
       </w:r>
       <w:r>
-        <w:t>Authored Atlas of Blank Maps, registered with the National Library and Archives of Egypt under Local Deposit No. 2022/15365 and ISBN 9789779426006.</w:t>
+        <w:t xml:space="preserve">Authored </w:t>
+      </w:r>
+      <w:r>
+        <w:rPr>
+          <w:b/>
+          <w:bCs/>
+        </w:rPr>
+        <w:t>Atlas of Blank Maps</w:t>
+      </w:r>
+      <w:r>
+        <w:t>, registered with the National Library and Archives of Egypt under Local Deposit No. 2022/15365 and ISBN 9789779426006.</w:t>
       </w:r>
     </w:p>
     <w:p>
@@ -1172,7 +1622,17 @@
         <w:t xml:space="preserve">• </w:t>
       </w:r>
       <w:r>
-        <w:t>Reviewed the 2020 edition of the World Atlas, produced by Dar Al-Irshad, Cairo Branch.</w:t>
+        <w:t xml:space="preserve">Reviewed </w:t>
+      </w:r>
+      <w:r>
+        <w:rPr>
+          <w:b/>
+          <w:bCs/>
+        </w:rPr>
+        <w:t>the 2020 edition of the World Atlas</w:t>
+      </w:r>
+      <w:r>
+        <w:t>, produced by Dar Al-Irshad, Cairo Branch.</w:t>
       </w:r>
     </w:p>
     <w:p>

</xml_diff>